<commit_message>
Oct 25 refresh, math review, faster pipeline (v0.8.0)
- Report, report data and dashboard data rebuilt from the Oct 25 run
- Seasonality adjusted for month length (children's July vs February
  gap +53% per day, not +68%); raw shares kept
- Race ratios also compared with the population of the states cases
  come from (young-adult American Indian / Alaska Native 4.7x -> 2.4x)
- Early-resolution figures from the weekly runs; MODELING.md math review
- Pipeline ~50 s -> ~28 s with identical outputs (stock_flow 20.6 -> 4.5 s,
  insights 7.2 -> 3.3 s)
- README: companion UC-Placement repository is public

Co-Authored-By: Claude Opus 5.5 <noreply@anthropic.com>
</commit_message>
<xml_diff>
--- a/Missing Children and Young Adults - Circumstances Report.docx
+++ b/Missing Children and Young Adults - Circumstances Report.docx
@@ -42,7 +42,7 @@
           <w:color w:val="5A6472"/>
           <w:sz w:val="20"/>
         </w:rPr>
-        <w:t>Open NamUs and NCMEC cases on October 22, 2026: 7,641 children and 4,729 young adults</w:t>
+        <w:t>Open NamUs and NCMEC cases on October 25, 2026: 7,571 children and 4,728 young adults</w:t>
       </w:r>
     </w:p>
     <w:tbl>
@@ -103,7 +103,7 @@
                 <w:rFonts w:ascii="Arial" w:hAnsi="Arial"/>
                 <w:sz w:val="22"/>
               </w:rPr>
-              <w:t>Every figure in Part 1 uses only children: people under 18 for their whole recorded age range. Young adults (18–25) are in Part 2 with their own figures, compared with the population of the same age. 3 records with no age, or an age range that straddles 18, are in neither part.</w:t>
+              <w:t>Every figure in Part 1 uses only children: people under 18 for their whole recorded age range. Young adults (18–25) are in Part 2 with their own figures, compared with the population of the same age. 4 records with no age, or an age range that straddles 18, are in neither part.</w:t>
             </w:r>
             <w:r>
               <w:rPr>
@@ -131,7 +131,7 @@
                 <w:rFonts w:ascii="Arial" w:hAnsi="Arial"/>
                 <w:sz w:val="22"/>
               </w:rPr>
-              <w:t>Counts are cases still listed on October 22, 2026. Since weekly collection began on 2026-10-21, 20 cases have dropped off the listings (found) and are not counted here.</w:t>
+              <w:t>Counts are cases still listed on October 25, 2026. Since weekly collection began on 2026-10-21, 139 cases have dropped off the listings (found) and are not counted here.</w:t>
             </w:r>
             <w:r>
               <w:rPr>
@@ -176,7 +176,7 @@
           <w:rFonts w:ascii="Arial" w:hAnsi="Arial"/>
           <w:sz w:val="22"/>
         </w:rPr>
-        <w:t>It appears in 66 of 7,641 open child cases (1%). National figures agree: NCMEC reports non-family abductions are about 1% of its cases, and FBI records coded “abducted by stranger” were 0.1% in 2023.</w:t>
+        <w:t>It appears in 66 of 7,571 open child cases (1%). National figures agree: NCMEC reports non-family abductions are about 1% of its cases, and FBI records coded “abducted by stranger” were 0.1% in 2023.</w:t>
       </w:r>
       <w:r>
         <w:rPr>
@@ -263,7 +263,7 @@
           <w:rFonts w:ascii="Arial" w:hAnsi="Arial"/>
           <w:sz w:val="22"/>
         </w:rPr>
-        <w:t>Compared with their share of Americans aged 0 to 17, they appear in open child cases since 2016 at 2.4x, 1.6x and 2.0x their population share.</w:t>
+        <w:t>Compared with their share of Americans aged 0 to 17, they appear in open child cases since 2016 at 2.3x, 1.6x and 2.1x their population share (2.3x, 1.4x and 1.9x against the population of the states the cases come from).</w:t>
       </w:r>
       <w:r>
         <w:rPr>
@@ -292,7 +292,7 @@
           <w:rFonts w:ascii="Arial" w:hAnsi="Arial"/>
           <w:sz w:val="22"/>
         </w:rPr>
-        <w:t>Open child runaway cases are typically 2 years old; open non-family abductions and suspected homicides of children, 40 and 41 years.</w:t>
+        <w:t>Open child runaway cases are typically 3 years old; open non-family abductions and suspected homicides of children, 40 and 41 years.</w:t>
       </w:r>
       <w:r>
         <w:rPr>
@@ -350,7 +350,7 @@
           <w:rFonts w:ascii="Arial" w:hAnsi="Arial"/>
           <w:sz w:val="22"/>
         </w:rPr>
-        <w:t>78% of child cases don’t say how the child went missing, and 37% mention any place or activity.</w:t>
+        <w:t>79% of child cases don’t say how the child went missing, and 38% mention any place or activity.</w:t>
       </w:r>
       <w:r>
         <w:rPr>
@@ -766,7 +766,7 @@
                 <w:rFonts w:ascii="Arial" w:hAnsi="Arial"/>
                 <w:sz w:val="19"/>
               </w:rPr>
-              <w:t>7,641</w:t>
+              <w:t>7,571</w:t>
             </w:r>
           </w:p>
         </w:tc>
@@ -836,7 +836,7 @@
                 <w:rFonts w:ascii="Arial" w:hAnsi="Arial"/>
                 <w:sz w:val="19"/>
               </w:rPr>
-              <w:t>4,729</w:t>
+              <w:t>4,728</w:t>
             </w:r>
           </w:p>
         </w:tc>
@@ -905,7 +905,7 @@
                 <w:rFonts w:ascii="Arial" w:hAnsi="Arial"/>
                 <w:sz w:val="19"/>
               </w:rPr>
-              <w:t>3</w:t>
+              <w:t>4</w:t>
             </w:r>
           </w:p>
         </w:tc>
@@ -1130,7 +1130,7 @@
                 <w:rFonts w:ascii="Arial" w:hAnsi="Arial"/>
                 <w:sz w:val="19"/>
               </w:rPr>
-              <w:t>5,995</w:t>
+              <w:t>5,999</w:t>
             </w:r>
           </w:p>
         </w:tc>
@@ -1153,7 +1153,7 @@
                 <w:rFonts w:ascii="Arial" w:hAnsi="Arial"/>
                 <w:sz w:val="19"/>
               </w:rPr>
-              <w:t>78%</w:t>
+              <w:t>79%</w:t>
             </w:r>
           </w:p>
         </w:tc>
@@ -1203,7 +1203,7 @@
                 <w:rFonts w:ascii="Arial" w:hAnsi="Arial"/>
                 <w:sz w:val="19"/>
               </w:rPr>
-              <w:t>653</w:t>
+              <w:t>579</w:t>
             </w:r>
           </w:p>
         </w:tc>
@@ -1227,7 +1227,7 @@
                 <w:rFonts w:ascii="Arial" w:hAnsi="Arial"/>
                 <w:sz w:val="19"/>
               </w:rPr>
-              <w:t>9%</w:t>
+              <w:t>8%</w:t>
             </w:r>
           </w:p>
         </w:tc>
@@ -1534,7 +1534,7 @@
           <w:color w:val="5A6472"/>
           <w:sz w:val="18"/>
         </w:rPr>
-        <w:t>Share of all 7,641 open child cases.</w:t>
+        <w:t>Share of all 7,571 open child cases.</w:t>
       </w:r>
       <w:r>
         <w:rPr>
@@ -1679,7 +1679,7 @@
                 <w:rFonts w:ascii="Arial" w:hAnsi="Arial"/>
                 <w:sz w:val="19"/>
               </w:rPr>
-              <w:t>388</w:t>
+              <w:t>314</w:t>
             </w:r>
           </w:p>
         </w:tc>
@@ -2094,7 +2094,7 @@
         <w:pStyle w:val="Heading2"/>
       </w:pPr>
       <w:r>
-        <w:t>Children 11 and under (1,761 cases)</w:t>
+        <w:t>Children 11 and under (1,760 cases)</w:t>
       </w:r>
     </w:p>
     <w:p>
@@ -2621,7 +2621,7 @@
                 <w:rFonts w:ascii="Arial" w:hAnsi="Arial"/>
                 <w:sz w:val="19"/>
               </w:rPr>
-              <w:t>10</w:t>
+              <w:t>9</w:t>
             </w:r>
           </w:p>
         </w:tc>
@@ -3745,7 +3745,7 @@
           <w:color w:val="5A6472"/>
           <w:sz w:val="18"/>
         </w:rPr>
-        <w:t>782 of 1,761 cases in this group (44%) mention any place or activity. Shares are out of all cases in the group.</w:t>
+        <w:t>782 of 1,760 cases in this group (44%) mention any place or activity. Shares are out of all cases in the group.</w:t>
       </w:r>
       <w:r>
         <w:rPr>
@@ -3761,7 +3761,7 @@
         <w:pStyle w:val="Heading2"/>
       </w:pPr>
       <w:r>
-        <w:t>Teens 12 to 17 (5,880 cases)</w:t>
+        <w:t>Teens 12 to 17 (5,811 cases)</w:t>
       </w:r>
     </w:p>
     <w:p>
@@ -3925,7 +3925,7 @@
                 <w:rFonts w:ascii="Arial" w:hAnsi="Arial"/>
                 <w:sz w:val="19"/>
               </w:rPr>
-              <w:t>4,949</w:t>
+              <w:t>4,953</w:t>
             </w:r>
           </w:p>
         </w:tc>
@@ -3948,7 +3948,7 @@
                 <w:rFonts w:ascii="Arial" w:hAnsi="Arial"/>
                 <w:sz w:val="19"/>
               </w:rPr>
-              <w:t>84%</w:t>
+              <w:t>85%</w:t>
             </w:r>
           </w:p>
         </w:tc>
@@ -3998,7 +3998,7 @@
                 <w:rFonts w:ascii="Arial" w:hAnsi="Arial"/>
                 <w:sz w:val="19"/>
               </w:rPr>
-              <w:t>643</w:t>
+              <w:t>570</w:t>
             </w:r>
           </w:p>
         </w:tc>
@@ -4022,7 +4022,7 @@
                 <w:rFonts w:ascii="Arial" w:hAnsi="Arial"/>
                 <w:sz w:val="19"/>
               </w:rPr>
-              <w:t>11%</w:t>
+              <w:t>10%</w:t>
             </w:r>
           </w:p>
         </w:tc>
@@ -4093,7 +4093,7 @@
                 <w:rFonts w:ascii="Arial" w:hAnsi="Arial"/>
                 <w:sz w:val="19"/>
               </w:rPr>
-              <w:t>2%</w:t>
+              <w:t>3%</w:t>
             </w:r>
           </w:p>
         </w:tc>
@@ -4609,7 +4609,7 @@
                 <w:rFonts w:ascii="Arial" w:hAnsi="Arial"/>
                 <w:sz w:val="19"/>
               </w:rPr>
-              <w:t>244</w:t>
+              <w:t>245</w:t>
             </w:r>
           </w:p>
         </w:tc>
@@ -4658,7 +4658,7 @@
                 <w:rFonts w:ascii="Arial" w:hAnsi="Arial"/>
                 <w:sz w:val="19"/>
               </w:rPr>
-              <w:t>Park / outdoors / water</w:t>
+              <w:t>Vehicle / transit</w:t>
             </w:r>
           </w:p>
         </w:tc>
@@ -4682,7 +4682,7 @@
                 <w:rFonts w:ascii="Arial" w:hAnsi="Arial"/>
                 <w:sz w:val="19"/>
               </w:rPr>
-              <w:t>215</w:t>
+              <w:t>214</w:t>
             </w:r>
           </w:p>
         </w:tc>
@@ -4731,7 +4731,7 @@
                 <w:rFonts w:ascii="Arial" w:hAnsi="Arial"/>
                 <w:sz w:val="19"/>
               </w:rPr>
-              <w:t>Vehicle / transit</w:t>
+              <w:t>Park / outdoors / water</w:t>
             </w:r>
           </w:p>
         </w:tc>
@@ -5412,7 +5412,7 @@
           <w:color w:val="5A6472"/>
           <w:sz w:val="18"/>
         </w:rPr>
-        <w:t>2,060 of 5,880 cases in this group (35%) mention any place or activity. Shares are out of all cases in the group.</w:t>
+        <w:t>2,059 of 5,811 cases in this group (35%) mention any place or activity. Shares are out of all cases in the group.</w:t>
       </w:r>
       <w:r>
         <w:rPr>
@@ -5859,7 +5859,7 @@
           <w:rFonts w:ascii="Arial" w:hAnsi="Arial"/>
           <w:sz w:val="22"/>
         </w:rPr>
-        <w:t>Each insight uses only the 7,641 open child cases and, for comparisons, the Census population aged 0 to 17.</w:t>
+        <w:t>Each insight uses only the 7,571 open child cases and, for comparisons, the Census population aged 0 to 17.</w:t>
       </w:r>
       <w:r>
         <w:rPr>
@@ -5887,7 +5887,7 @@
           <w:rFonts w:ascii="Arial" w:hAnsi="Arial"/>
           <w:sz w:val="22"/>
         </w:rPr>
-        <w:t>Age 16 is the most common age at disappearance (1,697 open cases); ages 15 to 17 account for 59% of open child cases. Under 12, boys and girls are about equal (49% female); among teens, girls are the majority (58% female).</w:t>
+        <w:t>Age 16 is the most common age at disappearance (1,676 open cases); ages 15 to 17 account for 59% of open child cases. Under 12, boys and girls are about equal (49% female); among teens, girls are the majority (58% female).</w:t>
       </w:r>
       <w:r>
         <w:rPr>
@@ -6083,7 +6083,7 @@
           <w:rFonts w:ascii="Arial" w:hAnsi="Arial"/>
           <w:sz w:val="22"/>
         </w:rPr>
-        <w:t>Among open child cases since 2016 with race or ethnicity recorded (4,304), 33.0% are Black children, who are 13.9% of Americans aged 0 to 17: 2.4x their population share. The ratio is 1.6x for Hispanic and 2.0x for American Indian and Alaska Native children; White (0.5x) and Asian (0.2x) children are under-represented.</w:t>
+        <w:t>Among open child cases since 2016 with race or ethnicity recorded (4,236), 32.2% are Black children, who are 13.9% of Americans aged 0 to 17: 2.3x their population share. The ratio is 1.6x for Hispanic and 2.1x for American Indian and Alaska Native children; White (0.5x) and Asian (0.2x) children are under-represented.</w:t>
       </w:r>
       <w:r>
         <w:rPr>
@@ -6103,7 +6103,7 @@
           <w:rFonts w:ascii="Arial" w:hAnsi="Arial"/>
           <w:sz w:val="22"/>
         </w:rPr>
-        <w:t>The pattern holds in each database (Black children: 28% of NamUs and 39% of NCMEC cases) and is not explained by migration: 38 of 1,804 Hispanic child cases (2%) mention a border crossing, migrants or unaccompanied minors. This shows who is in the open-case listings, not who is most likely to go missing; differences in how quickly cases are resolved, reported and publicized could all play a part.</w:t>
+        <w:t>The pattern holds in each database (Black children: 28% of NamUs and 38% of NCMEC cases) and is not explained by migration: 38 of 1,793 Hispanic child cases (2%) mention a border crossing, migrants or unaccompanied minors. This shows who is in the open-case listings, not who is most likely to go missing; differences in how quickly cases are resolved, reported and publicized could all play a part.</w:t>
       </w:r>
       <w:r>
         <w:rPr>
@@ -6112,6 +6112,34 @@
           <w:sz w:val="18"/>
         </w:rPr>
         <w:t xml:space="preserve"> [7]</w:t>
+      </w:r>
+    </w:p>
+    <w:p>
+      <w:pPr>
+        <w:spacing w:before="0" w:after="140" w:line="288" w:lineRule="auto"/>
+      </w:pPr>
+      <w:r>
+        <w:rPr>
+          <w:rFonts w:ascii="Arial" w:hAnsi="Arial"/>
+          <w:b/>
+          <w:sz w:val="22"/>
+        </w:rPr>
+        <w:t xml:space="preserve">Checked against where cases come from. </w:t>
+      </w:r>
+      <w:r>
+        <w:rPr>
+          <w:rFonts w:ascii="Arial" w:hAnsi="Arial"/>
+          <w:sz w:val="22"/>
+        </w:rPr>
+        <w:t>Cases are concentrated in a few states whose populations differ from the nation’s, so each group was also compared with the population of the states its cases come from (each state weighted by its share of cases). Black children stay at 2.3x, Hispanic children fall to 1.4x and American Indian / Alaska Native children to 1.9x: geography explains a little of the gap, not most of it.</w:t>
+      </w:r>
+      <w:r>
+        <w:rPr>
+          <w:rFonts w:ascii="Arial" w:hAnsi="Arial"/>
+          <w:color w:val="5A6472"/>
+          <w:sz w:val="18"/>
+        </w:rPr>
+        <w:t xml:space="preserve"> [7], [8]</w:t>
       </w:r>
     </w:p>
     <w:p>
@@ -6201,7 +6229,7 @@
           <w:rFonts w:ascii="Arial" w:hAnsi="Arial"/>
           <w:sz w:val="22"/>
         </w:rPr>
-        <w:t>Among open child cases, the typical runaway went missing 2.4 years ago; a family abduction 16 years, an outdoor or water case 32, a non-family abduction 40 and possible foul play 41. 39% of NCMEC’s open child posters are under a year old; the median NamUs child case is 9 years old.</w:t>
+        <w:t>Among open child cases, the typical runaway went missing 3.0 years ago; a family abduction 16 years, an outdoor or water case 32, a non-family abduction 40 and possible foul play 41. 38% of NCMEC’s open child posters are under a year old; the median NamUs child case is 9 years old.</w:t>
       </w:r>
       <w:r>
         <w:rPr>
@@ -6299,7 +6327,7 @@
           <w:rFonts w:ascii="Arial" w:hAnsi="Arial"/>
           <w:sz w:val="22"/>
         </w:rPr>
-        <w:t>July has the most child disappearances (10.7%) and February the fewest (6.4%). Cases from the last 12 months and dates recorded as January 1 are left out.</w:t>
+        <w:t>Adjusted for month length, July has the most child disappearances per day and February the fewest: about 53% more per day. Cases from the last 12 months and dates recorded as January 1 are left out.</w:t>
       </w:r>
       <w:r>
         <w:rPr>
@@ -6369,7 +6397,7 @@
           <w:color w:val="5A6472"/>
           <w:sz w:val="18"/>
         </w:rPr>
-        <w:t>Share of child cases by month of disappearance; the dashed line is an even spread (8.3%).</w:t>
+        <w:t>Share of child cases by month of disappearance, adjusted for month length (cases per day); the dashed line is an even spread (8.3%).</w:t>
       </w:r>
       <w:r>
         <w:rPr>
@@ -6593,7 +6621,7 @@
           <w:rFonts w:ascii="Arial" w:hAnsi="Arial"/>
           <w:sz w:val="22"/>
         </w:rPr>
-        <w:t>Since 2016, the national rate is 5.9 open child cases per 100,000 children, but states differ widely. The highest rates come from states that post many cases to one database: Virginia’s are mostly NCMEC posters (400 of 431) and Tennessee’s mostly NamUs records (350 of 388). These are not risk rates.</w:t>
+        <w:t>Since 2016, the national rate is 5.8 open child cases per 100,000 children, but states differ widely. The highest rates come from states that post many cases to one database: Virginia’s are mostly NCMEC posters (325 of 356) and Tennessee’s mostly NamUs records (350 of 388). These are not risk rates.</w:t>
       </w:r>
       <w:r>
         <w:rPr>
@@ -6862,7 +6890,7 @@
                 <w:rFonts w:ascii="Arial" w:hAnsi="Arial"/>
                 <w:sz w:val="19"/>
               </w:rPr>
-              <w:t>431</w:t>
+              <w:t>356</w:t>
             </w:r>
           </w:p>
         </w:tc>
@@ -6886,7 +6914,7 @@
                 <w:rFonts w:ascii="Arial" w:hAnsi="Arial"/>
                 <w:sz w:val="19"/>
               </w:rPr>
-              <w:t>22.9</w:t>
+              <w:t>18.9</w:t>
             </w:r>
           </w:p>
         </w:tc>
@@ -6907,7 +6935,7 @@
                 <w:rFonts w:ascii="Arial" w:hAnsi="Arial"/>
                 <w:sz w:val="19"/>
               </w:rPr>
-              <w:t>31 / 400</w:t>
+              <w:t>31 / 325</w:t>
             </w:r>
           </w:p>
         </w:tc>
@@ -6955,7 +6983,7 @@
                 <w:rFonts w:ascii="Arial" w:hAnsi="Arial"/>
                 <w:sz w:val="19"/>
               </w:rPr>
-              <w:t>135</w:t>
+              <w:t>134</w:t>
             </w:r>
           </w:p>
         </w:tc>
@@ -6978,7 +7006,7 @@
                 <w:rFonts w:ascii="Arial" w:hAnsi="Arial"/>
                 <w:sz w:val="19"/>
               </w:rPr>
-              <w:t>14.0</w:t>
+              <w:t>13.9</w:t>
             </w:r>
           </w:p>
         </w:tc>
@@ -6998,7 +7026,7 @@
                 <w:rFonts w:ascii="Arial" w:hAnsi="Arial"/>
                 <w:sz w:val="19"/>
               </w:rPr>
-              <w:t>112 / 23</w:t>
+              <w:t>112 / 22</w:t>
             </w:r>
           </w:p>
         </w:tc>
@@ -7048,7 +7076,7 @@
                 <w:rFonts w:ascii="Arial" w:hAnsi="Arial"/>
                 <w:sz w:val="19"/>
               </w:rPr>
-              <w:t>579</w:t>
+              <w:t>577</w:t>
             </w:r>
           </w:p>
         </w:tc>
@@ -7072,7 +7100,7 @@
                 <w:rFonts w:ascii="Arial" w:hAnsi="Arial"/>
                 <w:sz w:val="19"/>
               </w:rPr>
-              <w:t>12.9</w:t>
+              <w:t>12.8</w:t>
             </w:r>
           </w:p>
         </w:tc>
@@ -7093,7 +7121,7 @@
                 <w:rFonts w:ascii="Arial" w:hAnsi="Arial"/>
                 <w:sz w:val="19"/>
               </w:rPr>
-              <w:t>482 / 97</w:t>
+              <w:t>482 / 95</w:t>
             </w:r>
           </w:p>
         </w:tc>
@@ -7141,7 +7169,7 @@
                 <w:rFonts w:ascii="Arial" w:hAnsi="Arial"/>
                 <w:sz w:val="19"/>
               </w:rPr>
-              <w:t>692</w:t>
+              <w:t>689</w:t>
             </w:r>
           </w:p>
         </w:tc>
@@ -7184,7 +7212,7 @@
                 <w:rFonts w:ascii="Arial" w:hAnsi="Arial"/>
                 <w:sz w:val="19"/>
               </w:rPr>
-              <w:t>536 / 156</w:t>
+              <w:t>536 / 153</w:t>
             </w:r>
           </w:p>
         </w:tc>
@@ -8100,7 +8128,7 @@
           <w:rFonts w:ascii="Arial" w:hAnsi="Arial"/>
           <w:sz w:val="22"/>
         </w:rPr>
-        <w:t>218 of 3,118 NCMEC children (7%) went missing with a sibling or another child.</w:t>
+        <w:t>218 of 3,048 NCMEC children (7%) went missing with a sibling or another child.</w:t>
       </w:r>
       <w:r>
         <w:rPr>
@@ -8129,7 +8157,7 @@
           <w:rFonts w:ascii="Arial" w:hAnsi="Arial"/>
           <w:sz w:val="22"/>
         </w:rPr>
-        <w:t>93 teen records mention foster care, a group home, a shelter or a state placement, including 47 of 643 teen runaway cases (7%); a minimum, since most records don’t say where the teen lived.</w:t>
+        <w:t>93 teen records mention foster care, a group home, a shelter or a state placement, including 47 of 570 teen runaway cases (8%); a minimum, since most records don’t say where the teen lived.</w:t>
       </w:r>
       <w:r>
         <w:rPr>
@@ -9332,7 +9360,7 @@
           <w:rFonts w:ascii="Arial" w:hAnsi="Arial"/>
           <w:sz w:val="22"/>
         </w:rPr>
-        <w:t>108 children have an earlier event in their record (27 mention a history of running away).</w:t>
+        <w:t>107 children have an earlier event in their record (27 mention a history of running away).</w:t>
       </w:r>
       <w:r>
         <w:rPr>
@@ -9390,7 +9418,7 @@
           <w:rFonts w:ascii="Arial" w:hAnsi="Arial"/>
           <w:sz w:val="22"/>
         </w:rPr>
-        <w:t>Neither database publishes outcomes; a case drops off when the child is located. Weekly collection since 2026-10-21 has recorded 20 children found so far.</w:t>
+        <w:t>Neither database publishes outcomes; a case drops off when the child is located. Weekly collection since 2026-10-21 has recorded 138 children found so far.</w:t>
       </w:r>
       <w:r>
         <w:rPr>
@@ -9399,6 +9427,35 @@
           <w:sz w:val="18"/>
         </w:rPr>
         <w:t xml:space="preserve"> [1], [2], [7]</w:t>
+      </w:r>
+    </w:p>
+    <w:p>
+      <w:pPr>
+        <w:pStyle w:val="ListBullet"/>
+        <w:spacing w:before="0" w:after="80" w:line="276" w:lineRule="auto"/>
+      </w:pPr>
+      <w:r>
+        <w:rPr>
+          <w:rFonts w:ascii="Arial" w:hAnsi="Arial"/>
+          <w:b/>
+          <w:sz w:val="22"/>
+        </w:rPr>
+        <w:t xml:space="preserve">Found quickly, or not for years: </w:t>
+      </w:r>
+      <w:r>
+        <w:rPr>
+          <w:rFonts w:ascii="Arial" w:hAnsi="Arial"/>
+          <w:sz w:val="22"/>
+        </w:rPr>
+        <w:t>Of NCMEC child cases listed on 2026-10-22, 23% of those open 30 days or less were found within 3 days, against 7% of those open 31–90 days, 1% at 3–12 months and 0% of those open over 5 years. It is one short window, but it shows the same fast and slow groups as the national model.</w:t>
+      </w:r>
+      <w:r>
+        <w:rPr>
+          <w:rFonts w:ascii="Arial" w:hAnsi="Arial"/>
+          <w:color w:val="5A6472"/>
+          <w:sz w:val="18"/>
+        </w:rPr>
+        <w:t xml:space="preserve"> [2], [7]</w:t>
       </w:r>
     </w:p>
     <w:p>
@@ -9418,7 +9475,7 @@
           <w:rFonts w:ascii="Arial" w:hAnsi="Arial"/>
           <w:sz w:val="22"/>
         </w:rPr>
-        <w:t>These 4,729 open cases are kept apart from the children in Part 1 and compared with the population aged 18 to 25. They are context for the children’s figures, not part of them.</w:t>
+        <w:t>These 4,728 open cases are kept apart from the children in Part 1 and compared with the population aged 18 to 25. They are context for the children’s figures, not part of them.</w:t>
       </w:r>
       <w:r>
         <w:rPr>
@@ -9578,7 +9635,7 @@
                 <w:rFonts w:ascii="Arial" w:hAnsi="Arial"/>
                 <w:sz w:val="19"/>
               </w:rPr>
-              <w:t>4,047</w:t>
+              <w:t>4,046</w:t>
             </w:r>
           </w:p>
         </w:tc>
@@ -10051,7 +10108,7 @@
                 <w:rFonts w:ascii="Arial" w:hAnsi="Arial"/>
                 <w:sz w:val="19"/>
               </w:rPr>
-              <w:t>4,047</w:t>
+              <w:t>4,046</w:t>
             </w:r>
           </w:p>
         </w:tc>
@@ -11464,7 +11521,7 @@
           <w:color w:val="5A6472"/>
           <w:sz w:val="18"/>
         </w:rPr>
-        <w:t>2,650 of 4,729 cases in this group (56%) mention any place or activity. Shares are out of all cases in the group.</w:t>
+        <w:t>2,650 of 4,728 cases in this group (56%) mention any place or activity. Shares are out of all cases in the group.</w:t>
       </w:r>
       <w:r>
         <w:rPr>
@@ -11696,7 +11753,7 @@
           <w:rFonts w:ascii="Arial" w:hAnsi="Arial"/>
           <w:sz w:val="22"/>
         </w:rPr>
-        <w:t>They appear in open cases since 2016 at 4.7x their share of Americans aged 18 to 25 (children: 2.0x). Black (1.7x) and Hispanic (1.4x) young adults are also over-represented.</w:t>
+        <w:t>They appear in open cases since 2016 at 4.7x their share of Americans aged 18 to 25 (children: 2.1x). Black (1.7x) and Hispanic (1.4x) young adults are also over-represented. Much of the American Indian / Alaska Native gap is geography: against the population of the states the cases come from, it is 2.4x, and Hispanic young adults are 1.2x; Black young adults stay at 1.8x.</w:t>
       </w:r>
       <w:r>
         <w:rPr>
@@ -11794,7 +11851,7 @@
           <w:rFonts w:ascii="Arial" w:hAnsi="Arial"/>
           <w:sz w:val="22"/>
         </w:rPr>
-        <w:t>Open young-adult runaway cases are typically 8 years old (children: 2.4); cases with no stated cause, 23 years (children: 5).</w:t>
+        <w:t>Open young-adult runaway cases are typically 8 years old (children: 3.0); cases with no stated cause, 23 years (children: 5).</w:t>
       </w:r>
       <w:r>
         <w:rPr>
@@ -11892,7 +11949,7 @@
           <w:rFonts w:ascii="Arial" w:hAnsi="Arial"/>
           <w:sz w:val="22"/>
         </w:rPr>
-        <w:t>June has the most young-adult disappearances (10.0%) and January the fewest (7.2%).</w:t>
+        <w:t>Adjusted for month length, June has the most young-adult disappearances per day and December the fewest: about 40% more per day.</w:t>
       </w:r>
       <w:r>
         <w:rPr>
@@ -11962,7 +12019,7 @@
           <w:color w:val="5A6472"/>
           <w:sz w:val="18"/>
         </w:rPr>
-        <w:t>Share of young-adult cases by month of disappearance.</w:t>
+        <w:t>Share of young-adult cases by month of disappearance, adjusted for month length.</w:t>
       </w:r>
       <w:r>
         <w:rPr>
@@ -13843,7 +13900,7 @@
           <w:rFonts w:ascii="Arial" w:hAnsi="Arial"/>
           <w:sz w:val="22"/>
         </w:rPr>
-        <w:t>Most records are short: 78% of child cases don’t say how the child went missing, so the shares for known categories are minimums.</w:t>
+        <w:t>Most records are short: 79% of child cases don’t say how the child went missing, so the shares for known categories are minimums.</w:t>
       </w:r>
     </w:p>
     <w:p>
@@ -13977,7 +14034,7 @@
           <w:rFonts w:ascii="Arial" w:hAnsi="Arial"/>
           <w:sz w:val="20"/>
         </w:rPr>
-        <w:t>Accessed October 22, 2026.</w:t>
+        <w:t>Accessed October 25, 2026.</w:t>
       </w:r>
     </w:p>
     <w:p>
@@ -14023,7 +14080,7 @@
           <w:rFonts w:ascii="Arial" w:hAnsi="Arial"/>
           <w:sz w:val="20"/>
         </w:rPr>
-        <w:t>Accessed October 22, 2026.</w:t>
+        <w:t>Accessed October 25, 2026.</w:t>
       </w:r>
     </w:p>
     <w:p>
@@ -14186,7 +14243,7 @@
           <w:rFonts w:ascii="Arial" w:hAnsi="Arial"/>
           <w:sz w:val="20"/>
         </w:rPr>
-        <w:t>Accessed October 22, 2026.</w:t>
+        <w:t>Accessed October 25, 2026.</w:t>
       </w:r>
     </w:p>
     <w:p>
@@ -14214,7 +14271,7 @@
           <w:rFonts w:ascii="Arial" w:hAnsi="Arial"/>
           <w:sz w:val="20"/>
         </w:rPr>
-        <w:t>Latest collection October 22, 2026.</w:t>
+        <w:t>Latest collection October 25, 2026.</w:t>
       </w:r>
     </w:p>
     <w:p>

</xml_diff>